<commit_message>
Act 2 Chronological fix
</commit_message>
<xml_diff>
--- a/publish/The Quantum Cross.docx
+++ b/publish/The Quantum Cross.docx
@@ -22,7 +22,7 @@
       </w:pPr>
       <w:r>
         <w:rPr/>
-        <w:t xml:space="preserve">First Light</w:t>
+        <w:t xml:space="preserve">Chapter 1: First Light</w:t>
       </w:r>
     </w:p>
     <w:p>
@@ -293,7 +293,7 @@
       </w:pPr>
       <w:r>
         <w:rPr/>
-        <w:t xml:space="preserve">The Guardian's Test</w:t>
+        <w:t xml:space="preserve">Chapter 2: The Guardian's Test</w:t>
       </w:r>
     </w:p>
     <w:p>
@@ -663,7 +663,7 @@
       </w:pPr>
       <w:r>
         <w:rPr/>
-        <w:t xml:space="preserve">The Encounter</w:t>
+        <w:t xml:space="preserve">Chapter 3: The Encounter</w:t>
       </w:r>
     </w:p>
     <w:p>
@@ -978,7 +978,7 @@
       </w:pPr>
       <w:r>
         <w:rPr/>
-        <w:t xml:space="preserve">What the Touch Left</w:t>
+        <w:t xml:space="preserve">Chapter 4: What the Touch Left</w:t>
       </w:r>
     </w:p>
     <w:p>
@@ -1149,7 +1149,7 @@
       </w:pPr>
       <w:r>
         <w:rPr/>
-        <w:t xml:space="preserve">The Pressure Builds</w:t>
+        <w:t xml:space="preserve">Chapter 5: The Pressure Builds</w:t>
       </w:r>
     </w:p>
     <w:p>
@@ -1508,7 +1508,7 @@
       </w:pPr>
       <w:r>
         <w:rPr/>
-        <w:t xml:space="preserve">Sacred Eight</w:t>
+        <w:t xml:space="preserve">Chapter 6: Sacred Eight</w:t>
       </w:r>
     </w:p>
     <w:p>
@@ -1806,7 +1806,7 @@
       </w:pPr>
       <w:r>
         <w:rPr/>
-        <w:t xml:space="preserve">Gathering Storm</w:t>
+        <w:t xml:space="preserve">Chapter 7: Gathering Storm</w:t>
       </w:r>
     </w:p>
     <w:p>
@@ -2014,7 +2014,7 @@
       </w:pPr>
       <w:r>
         <w:rPr/>
-        <w:t xml:space="preserve">Forces Converging</w:t>
+        <w:t xml:space="preserve">Chapter 8: Forces Converging</w:t>
       </w:r>
     </w:p>
     <w:p>
@@ -2204,7 +2204,7 @@
       </w:pPr>
       <w:r>
         <w:rPr/>
-        <w:t xml:space="preserve">The Last Time He Came</w:t>
+        <w:t xml:space="preserve">Chapter 9: The Last Time He Came</w:t>
       </w:r>
     </w:p>
     <w:p>
@@ -2448,7 +2448,7 @@
       </w:pPr>
       <w:r>
         <w:rPr/>
-        <w:t xml:space="preserve">The Woodcutters</w:t>
+        <w:t xml:space="preserve">Chapter 10: The Woodcutters</w:t>
       </w:r>
     </w:p>
     <w:p>
@@ -3016,7 +3016,7 @@
       </w:pPr>
       <w:r>
         <w:rPr/>
-        <w:t xml:space="preserve">The Waiting Cross</w:t>
+        <w:t xml:space="preserve">Chapter 11: The Waiting Cross</w:t>
       </w:r>
     </w:p>
     <w:p>
@@ -3260,7 +3260,7 @@
       </w:pPr>
       <w:r>
         <w:rPr/>
-        <w:t xml:space="preserve">Sacred Waiting</w:t>
+        <w:t xml:space="preserve">Chapter 12: Sacred Waiting</w:t>
       </w:r>
     </w:p>
     <w:p>
@@ -3423,7 +3423,7 @@
       </w:pPr>
       <w:r>
         <w:rPr/>
-        <w:t xml:space="preserve">Final Vigil</w:t>
+        <w:t xml:space="preserve">Chapter 13: Final Vigil</w:t>
       </w:r>
     </w:p>
     <w:p>
@@ -3649,7 +3649,7 @@
       </w:pPr>
       <w:r>
         <w:rPr/>
-        <w:t xml:space="preserve">Divine Summons</w:t>
+        <w:t xml:space="preserve">Chapter 14: Divine Summons</w:t>
       </w:r>
     </w:p>
     <w:p>
@@ -3875,7 +3875,7 @@
       </w:pPr>
       <w:r>
         <w:rPr/>
-        <w:t xml:space="preserve">Sacred Assembly</w:t>
+        <w:t xml:space="preserve">Chapter 15: Sacred Assembly</w:t>
       </w:r>
     </w:p>
     <w:p>
@@ -4101,7 +4101,7 @@
       </w:pPr>
       <w:r>
         <w:rPr/>
-        <w:t xml:space="preserve">Via Dolorosa - Procession</w:t>
+        <w:t xml:space="preserve">Chapter 16: Via Dolorosa - Procession</w:t>
       </w:r>
     </w:p>
     <w:p>
@@ -4327,7 +4327,7 @@
       </w:pPr>
       <w:r>
         <w:rPr/>
-        <w:t xml:space="preserve">Via Dolorosa - Final Ascent</w:t>
+        <w:t xml:space="preserve">Chapter 17: Via Dolorosa - Final Ascent</w:t>
       </w:r>
     </w:p>
     <w:p>
@@ -4571,7 +4571,7 @@
       </w:pPr>
       <w:r>
         <w:rPr/>
-        <w:t xml:space="preserve">Path of Redemption</w:t>
+        <w:t xml:space="preserve">Chapter 18: Path of Redemption</w:t>
       </w:r>
     </w:p>
     <w:p>
@@ -4815,7 +4815,7 @@
       </w:pPr>
       <w:r>
         <w:rPr/>
-        <w:t xml:space="preserve">The Raising</w:t>
+        <w:t xml:space="preserve">Chapter 19: The Raising</w:t>
       </w:r>
     </w:p>
     <w:p>
@@ -5266,7 +5266,7 @@
       </w:pPr>
       <w:r>
         <w:rPr/>
-        <w:t xml:space="preserve">The Hours</w:t>
+        <w:t xml:space="preserve">Chapter 20: The Hours</w:t>
       </w:r>
     </w:p>
     <w:p>
@@ -5519,7 +5519,7 @@
       </w:pPr>
       <w:r>
         <w:rPr/>
-        <w:t xml:space="preserve">The Dark Hours</w:t>
+        <w:t xml:space="preserve">Chapter 21: The Dark Hours</w:t>
       </w:r>
     </w:p>
     <w:p>
@@ -5781,7 +5781,7 @@
       </w:pPr>
       <w:r>
         <w:rPr/>
-        <w:t xml:space="preserve">The Long Afternoon</w:t>
+        <w:t xml:space="preserve">Chapter 22: The Long Afternoon</w:t>
       </w:r>
     </w:p>
     <w:p>
@@ -5980,7 +5980,7 @@
       </w:pPr>
       <w:r>
         <w:rPr/>
-        <w:t xml:space="preserve">The Last Words</w:t>
+        <w:t xml:space="preserve">Chapter 23: The Last Words</w:t>
       </w:r>
     </w:p>
     <w:p>
@@ -6296,7 +6296,7 @@
       </w:pPr>
       <w:r>
         <w:rPr/>
-        <w:t xml:space="preserve">The Lance</w:t>
+        <w:t xml:space="preserve">Chapter 24: The Lance</w:t>
       </w:r>
     </w:p>
     <w:p>
@@ -6621,7 +6621,7 @@
       </w:pPr>
       <w:r>
         <w:rPr/>
-        <w:t xml:space="preserve">Consummatum Est</w:t>
+        <w:t xml:space="preserve">Chapter 25: Consummatum Est</w:t>
       </w:r>
     </w:p>
     <w:p>
@@ -6856,7 +6856,7 @@
       </w:pPr>
       <w:r>
         <w:rPr/>
-        <w:t xml:space="preserve">The Sabbath</w:t>
+        <w:t xml:space="preserve">Chapter 26: The Sabbath</w:t>
       </w:r>
     </w:p>
     <w:p>
@@ -7145,7 +7145,7 @@
       </w:pPr>
       <w:r>
         <w:rPr/>
-        <w:t xml:space="preserve">Sacred Preservation</w:t>
+        <w:t xml:space="preserve">Chapter 27: Sacred Preservation</w:t>
       </w:r>
     </w:p>
     <w:p>
@@ -7569,7 +7569,7 @@
       </w:pPr>
       <w:r>
         <w:rPr/>
-        <w:t xml:space="preserve">Scattered Consciousness</w:t>
+        <w:t xml:space="preserve">Chapter 28: Scattered Consciousness</w:t>
       </w:r>
     </w:p>
     <w:p>
@@ -7894,7 +7894,7 @@
       </w:pPr>
       <w:r>
         <w:rPr/>
-        <w:t xml:space="preserve">Empire's End</w:t>
+        <w:t xml:space="preserve">Chapter 29: Empire's End</w:t>
       </w:r>
     </w:p>
     <w:p>
@@ -8679,7 +8679,7 @@
       </w:pPr>
       <w:r>
         <w:rPr/>
-        <w:t xml:space="preserve">The Last Box</w:t>
+        <w:t xml:space="preserve">Chapter 30: The Last Box</w:t>
       </w:r>
     </w:p>
     <w:p>
@@ -9341,7 +9341,7 @@
       </w:pPr>
       <w:r>
         <w:rPr/>
-        <w:t xml:space="preserve">Second Light (Discovery)</w:t>
+        <w:t xml:space="preserve">Chapter 31: Second Light (Discovery)</w:t>
       </w:r>
     </w:p>
     <w:p>
@@ -9810,7 +9810,7 @@
       </w:pPr>
       <w:r>
         <w:rPr/>
-        <w:t xml:space="preserve">Personal Histories</w:t>
+        <w:t xml:space="preserve">Chapter 32: Personal Histories</w:t>
       </w:r>
     </w:p>
     <w:p>
@@ -10466,7 +10466,7 @@
       </w:pPr>
       <w:r>
         <w:rPr/>
-        <w:t xml:space="preserve">The Harvard Crisis</w:t>
+        <w:t xml:space="preserve">Chapter 33: The Harvard Crisis</w:t>
       </w:r>
     </w:p>
     <w:p>
@@ -10974,7 +10974,7 @@
       </w:pPr>
       <w:r>
         <w:rPr/>
-        <w:t xml:space="preserve">Reformation Fires</w:t>
+        <w:t xml:space="preserve">Chapter 34: Reformation Fires</w:t>
       </w:r>
     </w:p>
     <w:p>
@@ -12229,7 +12229,7 @@
       </w:pPr>
       <w:r>
         <w:rPr/>
-        <w:t xml:space="preserve">Modern Silence</w:t>
+        <w:t xml:space="preserve">Chapter 35: Modern Silence</w:t>
       </w:r>
     </w:p>
     <w:p>
@@ -13943,7 +13943,7 @@
       </w:pPr>
       <w:r>
         <w:rPr/>
-        <w:t xml:space="preserve">The Printer's Hands</w:t>
+        <w:t xml:space="preserve">Chapter 36: The Printer's Hands</w:t>
       </w:r>
     </w:p>
     <w:p>
@@ -14644,7 +14644,7 @@
       </w:pPr>
       <w:r>
         <w:rPr/>
-        <w:t xml:space="preserve">Blood and Memory</w:t>
+        <w:t xml:space="preserve">Chapter 37: Blood and Memory</w:t>
       </w:r>
     </w:p>
     <w:p>
@@ -15756,7 +15756,7 @@
       </w:pPr>
       <w:r>
         <w:rPr/>
-        <w:t xml:space="preserve">The Leak</w:t>
+        <w:t xml:space="preserve">Chapter 38: The Leak</w:t>
       </w:r>
     </w:p>
     <w:p>
@@ -16037,7 +16037,7 @@
       </w:pPr>
       <w:r>
         <w:rPr/>
-        <w:t xml:space="preserve">Vatican Debates</w:t>
+        <w:t xml:space="preserve">Chapter 39: Vatican Debates</w:t>
       </w:r>
     </w:p>
     <w:p>
@@ -16974,7 +16974,7 @@
       </w:pPr>
       <w:r>
         <w:rPr/>
-        <w:t xml:space="preserve">The Decision</w:t>
+        <w:t xml:space="preserve">Chapter 40: The Decision</w:t>
       </w:r>
     </w:p>
     <w:p>
@@ -17781,7 +17781,7 @@
       </w:pPr>
       <w:r>
         <w:rPr/>
-        <w:t xml:space="preserve">The Reading</w:t>
+        <w:t xml:space="preserve">Chapter 41: The Reading</w:t>
       </w:r>
     </w:p>
     <w:p>
@@ -18986,7 +18986,7 @@
       </w:pPr>
       <w:r>
         <w:rPr/>
-        <w:t xml:space="preserve">The Fractal Analysis</w:t>
+        <w:t xml:space="preserve">Chapter 42: The Fractal Analysis</w:t>
       </w:r>
     </w:p>
     <w:p>
@@ -19247,7 +19247,7 @@
       </w:pPr>
       <w:r>
         <w:rPr/>
-        <w:t xml:space="preserve">Roman Welcome</w:t>
+        <w:t xml:space="preserve">Chapter 43: Roman Welcome</w:t>
       </w:r>
     </w:p>
     <w:p>
@@ -19684,7 +19684,7 @@
       </w:pPr>
       <w:r>
         <w:rPr/>
-        <w:t xml:space="preserve">The Cardinal's Doubt</w:t>
+        <w:t xml:space="preserve">Chapter 44: The Cardinal's Doubt</w:t>
       </w:r>
     </w:p>
     <w:p>
@@ -20592,7 +20592,7 @@
       </w:pPr>
       <w:r>
         <w:rPr/>
-        <w:t xml:space="preserve">Peer Review</w:t>
+        <w:t xml:space="preserve">Chapter 45: Peer Review</w:t>
       </w:r>
     </w:p>
     <w:p>
@@ -21114,7 +21114,7 @@
       </w:pPr>
       <w:r>
         <w:rPr/>
-        <w:t xml:space="preserve">Still Here</w:t>
+        <w:t xml:space="preserve">Chapter 46: Still Here</w:t>
       </w:r>
     </w:p>
     <w:p>

</xml_diff>